<commit_message>
A-01 auto-wypelnianie: Kraj, ulica, plec, DEGURBA, status, Uczestnik CIS, wyksztalcenie, ubostwo, D, H + A-03 nazwisko + B-02 rodzaj
</commit_message>
<xml_diff>
--- a/public/wzory/CIS_A-01_Pakiet_zgloszeniowy_uczestnika.docx
+++ b/public/wzory/CIS_A-01_Pakiet_zgloszeniowy_uczestnika.docx
@@ -534,7 +534,11 @@
             </w:tcMar>
             <w:vAlign w:val="center"/>
           </w:tcPr>
-          <w:p/>
+          <w:p>
+            <w:r>
+              <w:t>{{kraj}}</w:t>
+            </w:r>
+          </w:p>
         </w:tc>
       </w:tr>
       <w:tr>
@@ -876,7 +880,11 @@
             </w:tcMar>
             <w:vAlign w:val="center"/>
           </w:tcPr>
-          <w:p/>
+          <w:p>
+            <w:r>
+              <w:t>{{ulica_nr}}</w:t>
+            </w:r>
+          </w:p>
         </w:tc>
       </w:tr>
       <w:tr>
@@ -1032,21 +1040,21 @@
           <w:sz w:val="20"/>
           <w:szCs w:val="20"/>
         </w:rPr>
-        <w:t>☐  Kobieta</w:t>
-      </w:r>
-    </w:p>
-    <w:p>
-      <w:pPr>
-        <w:spacing w:before="20" w:after="20"/>
-        <w:ind w:left="200"/>
-      </w:pPr>
-      <w:r>
-        <w:rPr>
-          <w:color w:val="000000"/>
-          <w:sz w:val="20"/>
-          <w:szCs w:val="20"/>
-        </w:rPr>
-        <w:t>☐  Mężczyzna</w:t>
+        <w:t>{{cb_kobieta}}  Kobieta</w:t>
+      </w:r>
+    </w:p>
+    <w:p>
+      <w:pPr>
+        <w:spacing w:before="20" w:after="20"/>
+        <w:ind w:left="200"/>
+      </w:pPr>
+      <w:r>
+        <w:rPr>
+          <w:color w:val="000000"/>
+          <w:sz w:val="20"/>
+          <w:szCs w:val="20"/>
+        </w:rPr>
+        <w:t>{{cb_mezczyzna}}  Mężczyzna</w:t>
       </w:r>
     </w:p>
     <w:p>
@@ -1075,21 +1083,21 @@
           <w:sz w:val="20"/>
           <w:szCs w:val="20"/>
         </w:rPr>
-        <w:t>☐  Miasto (DEGURBA 1–2)</w:t>
-      </w:r>
-    </w:p>
-    <w:p>
-      <w:pPr>
-        <w:spacing w:before="20" w:after="20"/>
-        <w:ind w:left="200"/>
-      </w:pPr>
-      <w:r>
-        <w:rPr>
-          <w:color w:val="000000"/>
-          <w:sz w:val="20"/>
-          <w:szCs w:val="20"/>
-        </w:rPr>
-        <w:t>☐  Obszar wiejski (DEGURBA 3)</w:t>
+        <w:t>{{cb_miasto}}  Miasto (DEGURBA 1–2)</w:t>
+      </w:r>
+    </w:p>
+    <w:p>
+      <w:pPr>
+        <w:spacing w:before="20" w:after="20"/>
+        <w:ind w:left="200"/>
+      </w:pPr>
+      <w:r>
+        <w:rPr>
+          <w:color w:val="000000"/>
+          <w:sz w:val="20"/>
+          <w:szCs w:val="20"/>
+        </w:rPr>
+        <w:t>{{cb_wies}}  Obszar wiejski (DEGURBA 3)</w:t>
       </w:r>
     </w:p>
     <w:p>
@@ -1160,7 +1168,7 @@
           <w:sz w:val="20"/>
           <w:szCs w:val="20"/>
         </w:rPr>
-        <w:t>☐  Osoba bezrobotna niezarejestrowana w PUP</w:t>
+        <w:t>☒  Osoba bezrobotna niezarejestrowana w PUP</w:t>
       </w:r>
     </w:p>
     <w:p>
@@ -1217,7 +1225,7 @@
           <w:sz w:val="20"/>
           <w:szCs w:val="20"/>
         </w:rPr>
-        <w:t>☐  Uczestnik CIS (skierowanie do CIS + Indywidualny Program Zatrudnienia Socjalnego, świadczenie integracyjne)</w:t>
+        <w:t>☒  Uczestnik CIS (skierowanie do CIS + Indywidualny Program Zatrudnienia Socjalnego, świadczenie integracyjne)</w:t>
       </w:r>
     </w:p>
     <w:p>
@@ -1275,35 +1283,35 @@
           <w:sz w:val="20"/>
           <w:szCs w:val="20"/>
         </w:rPr>
-        <w:t>☐  Średnie I stopnia lub niższe (ISCED 0-2)</w:t>
-      </w:r>
-    </w:p>
-    <w:p>
-      <w:pPr>
-        <w:spacing w:before="20" w:after="20"/>
-        <w:ind w:left="200"/>
-      </w:pPr>
-      <w:r>
-        <w:rPr>
-          <w:color w:val="000000"/>
-          <w:sz w:val="20"/>
-          <w:szCs w:val="20"/>
-        </w:rPr>
-        <w:t>☐  Ponadgimnazjalne (ISCED 3) lub policealne (ISCED 4)</w:t>
-      </w:r>
-    </w:p>
-    <w:p>
-      <w:pPr>
-        <w:spacing w:before="20" w:after="20"/>
-        <w:ind w:left="200"/>
-      </w:pPr>
-      <w:r>
-        <w:rPr>
-          <w:color w:val="000000"/>
-          <w:sz w:val="20"/>
-          <w:szCs w:val="20"/>
-        </w:rPr>
-        <w:t>☐  Wyższe (ISCED 5-8)</w:t>
+        <w:t>{{cb_isced02}}  Średnie I stopnia lub niższe (ISCED 0-2)</w:t>
+      </w:r>
+    </w:p>
+    <w:p>
+      <w:pPr>
+        <w:spacing w:before="20" w:after="20"/>
+        <w:ind w:left="200"/>
+      </w:pPr>
+      <w:r>
+        <w:rPr>
+          <w:color w:val="000000"/>
+          <w:sz w:val="20"/>
+          <w:szCs w:val="20"/>
+        </w:rPr>
+        <w:t>{{cb_isced34}}  Ponadgimnazjalne (ISCED 3) lub policealne (ISCED 4)</w:t>
+      </w:r>
+    </w:p>
+    <w:p>
+      <w:pPr>
+        <w:spacing w:before="20" w:after="20"/>
+        <w:ind w:left="200"/>
+      </w:pPr>
+      <w:r>
+        <w:rPr>
+          <w:color w:val="000000"/>
+          <w:sz w:val="20"/>
+          <w:szCs w:val="20"/>
+        </w:rPr>
+        <w:t>{{cb_isced58}}  Wyższe (ISCED 5-8)</w:t>
       </w:r>
     </w:p>
     <w:p>
@@ -1470,7 +1478,7 @@
           <w:sz w:val="20"/>
           <w:szCs w:val="20"/>
         </w:rPr>
-        <w:t>☐  Osoba dotknięta ubóstwem</w:t>
+        <w:t>☒  Osoba dotknięta ubóstwem</w:t>
       </w:r>
     </w:p>
     <w:p>
@@ -1512,21 +1520,21 @@
           <w:sz w:val="20"/>
           <w:szCs w:val="20"/>
         </w:rPr>
-        <w:t>☐  Materiały w dużej czcionce</w:t>
-      </w:r>
-    </w:p>
-    <w:p>
-      <w:pPr>
-        <w:spacing w:before="20" w:after="20"/>
-        <w:ind w:left="200"/>
-      </w:pPr>
-      <w:r>
-        <w:rPr>
-          <w:color w:val="000000"/>
-          <w:sz w:val="20"/>
-          <w:szCs w:val="20"/>
-        </w:rPr>
-        <w:t>☐  Materiały w tekście łatwym do czytania (ETR)</w:t>
+        <w:t>☒  Materiały w dużej czcionce</w:t>
+      </w:r>
+    </w:p>
+    <w:p>
+      <w:pPr>
+        <w:spacing w:before="20" w:after="20"/>
+        <w:ind w:left="200"/>
+      </w:pPr>
+      <w:r>
+        <w:rPr>
+          <w:color w:val="000000"/>
+          <w:sz w:val="20"/>
+          <w:szCs w:val="20"/>
+        </w:rPr>
+        <w:t>☒  Materiały w tekście łatwym do czytania (ETR)</w:t>
       </w:r>
     </w:p>
     <w:p>
@@ -1722,7 +1730,7 @@
           <w:sz w:val="20"/>
           <w:szCs w:val="20"/>
         </w:rPr>
-        <w:t>☐  Płeć żeńska (10 pkt)</w:t>
+        <w:t>{{cb_kobieta}}  Płeć żeńska (10 pkt)</w:t>
       </w:r>
     </w:p>
     <w:p>
@@ -1962,21 +1970,21 @@
           <w:sz w:val="20"/>
           <w:szCs w:val="20"/>
         </w:rPr>
-        <w:t>☐  Potwierdzenie zamieszkania na terenie Gminy Świebodzin (kryterium terytorialne): oświadczenie/zaświadczenie o zamieszkaniu, wydruk z Profilu Zaufanego, zaświadczenie z ZUS z adresem zamieszkania.</w:t>
-      </w:r>
-    </w:p>
-    <w:p>
-      <w:pPr>
-        <w:spacing w:before="20" w:after="20"/>
-        <w:ind w:left="200"/>
-      </w:pPr>
-      <w:r>
-        <w:rPr>
-          <w:color w:val="000000"/>
-          <w:sz w:val="20"/>
-          <w:szCs w:val="20"/>
-        </w:rPr>
-        <w:t>☐  Zaświadczenie z PUP/ZUS o statusie osoby bezrobotnej / oświadczenie o bierności zawodowej.</w:t>
+        <w:t>☒  Potwierdzenie zamieszkania na terenie Gminy Świebodzin (kryterium terytorialne): oświadczenie/zaświadczenie o zamieszkaniu, wydruk z Profilu Zaufanego, zaświadczenie z ZUS z adresem zamieszkania.</w:t>
+      </w:r>
+    </w:p>
+    <w:p>
+      <w:pPr>
+        <w:spacing w:before="20" w:after="20"/>
+        <w:ind w:left="200"/>
+      </w:pPr>
+      <w:r>
+        <w:rPr>
+          <w:color w:val="000000"/>
+          <w:sz w:val="20"/>
+          <w:szCs w:val="20"/>
+        </w:rPr>
+        <w:t>☒  Zaświadczenie z PUP/ZUS o statusie osoby bezrobotnej / oświadczenie o bierności zawodowej.</w:t>
       </w:r>
     </w:p>
     <w:p>
@@ -2004,7 +2012,7 @@
           <w:sz w:val="20"/>
           <w:szCs w:val="20"/>
         </w:rPr>
-        <w:t>☐  Zaświadczenie z OPS / wywiad przy rekrutacji / dokumenty potwierdzające przesłanki wykluczenia.</w:t>
+        <w:t>☒  Zaświadczenie z OPS / wywiad przy rekrutacji / dokumenty potwierdzające przesłanki wykluczenia.</w:t>
       </w:r>
     </w:p>
     <w:p>

</xml_diff>

<commit_message>
Synchronizuj formularze CIS z katalogiem projektu
</commit_message>
<xml_diff>
--- a/public/wzory/CIS_A-01_Pakiet_zgloszeniowy_uczestnika.docx
+++ b/public/wzory/CIS_A-01_Pakiet_zgloszeniowy_uczestnika.docx
@@ -90,6 +90,7 @@
           <w:insideH w:val="single" w:sz="4" w:space="0" w:color="auto"/>
           <w:insideV w:val="single" w:sz="4" w:space="0" w:color="auto"/>
         </w:tblBorders>
+        <w:tblLayout w:type="fixed"/>
         <w:tblCellMar>
           <w:left w:w="10" w:type="dxa"/>
           <w:right w:w="10" w:type="dxa"/>
@@ -158,7 +159,7 @@
           </w:tcPr>
           <w:p>
             <w:r>
-              <w:t>{{imie}}</w:t>
+              <w:t xml:space="preserve">{{imie}}</w:t>
             </w:r>
           </w:p>
         </w:tc>
@@ -221,7 +222,7 @@
           </w:tcPr>
           <w:p>
             <w:r>
-              <w:t>{{nazwisko}}</w:t>
+              <w:t xml:space="preserve">{{nazwisko}}</w:t>
             </w:r>
           </w:p>
         </w:tc>
@@ -284,7 +285,7 @@
           </w:tcPr>
           <w:p>
             <w:r>
-              <w:t>{{pesel}}</w:t>
+              <w:t xml:space="preserve">{{pesel}}</w:t>
             </w:r>
           </w:p>
         </w:tc>
@@ -347,7 +348,7 @@
           </w:tcPr>
           <w:p>
             <w:r>
-              <w:t>{{data_urodzenia}}</w:t>
+              <w:t xml:space="preserve">{{data_urodzenia}}</w:t>
             </w:r>
           </w:p>
         </w:tc>
@@ -410,7 +411,7 @@
           </w:tcPr>
           <w:p>
             <w:r>
-              <w:t>{{wiek}}</w:t>
+              <w:t xml:space="preserve">{{wiek}}</w:t>
             </w:r>
           </w:p>
         </w:tc>
@@ -473,7 +474,7 @@
           </w:tcPr>
           <w:p>
             <w:r>
-              <w:t>{{obywatelstwo}}</w:t>
+              <w:t xml:space="preserve">{{obywatelstwo}}</w:t>
             </w:r>
           </w:p>
         </w:tc>
@@ -536,7 +537,7 @@
           </w:tcPr>
           <w:p>
             <w:r>
-              <w:t>{{kraj}}</w:t>
+              <w:t xml:space="preserve">{{kraj}}</w:t>
             </w:r>
           </w:p>
         </w:tc>
@@ -819,7 +820,7 @@
           </w:tcPr>
           <w:p>
             <w:r>
-              <w:t>{{miejscowosc}}</w:t>
+              <w:t xml:space="preserve">{{miejscowosc}}</w:t>
             </w:r>
           </w:p>
         </w:tc>
@@ -882,7 +883,7 @@
           </w:tcPr>
           <w:p>
             <w:r>
-              <w:t>{{ulica_nr}}</w:t>
+              <w:t xml:space="preserve">{{ulica_nr}}</w:t>
             </w:r>
           </w:p>
         </w:tc>
@@ -945,7 +946,7 @@
           </w:tcPr>
           <w:p>
             <w:r>
-              <w:t>{{kod_pocztowy}}</w:t>
+              <w:t xml:space="preserve">{{kod_pocztowy}}</w:t>
             </w:r>
           </w:p>
         </w:tc>
@@ -1008,7 +1009,7 @@
           </w:tcPr>
           <w:p>
             <w:r>
-              <w:t>{{telefon}}</w:t>
+              <w:t xml:space="preserve">{{telefon}}</w:t>
             </w:r>
           </w:p>
         </w:tc>
@@ -1040,21 +1041,21 @@
           <w:sz w:val="20"/>
           <w:szCs w:val="20"/>
         </w:rPr>
-        <w:t>{{cb_kobieta}}  Kobieta</w:t>
-      </w:r>
-    </w:p>
-    <w:p>
-      <w:pPr>
-        <w:spacing w:before="20" w:after="20"/>
-        <w:ind w:left="200"/>
-      </w:pPr>
-      <w:r>
-        <w:rPr>
-          <w:color w:val="000000"/>
-          <w:sz w:val="20"/>
-          <w:szCs w:val="20"/>
-        </w:rPr>
-        <w:t>{{cb_mezczyzna}}  Mężczyzna</w:t>
+        <w:t xml:space="preserve">{{cb_kobieta}} Kobieta</w:t>
+      </w:r>
+    </w:p>
+    <w:p>
+      <w:pPr>
+        <w:spacing w:before="20" w:after="20"/>
+        <w:ind w:left="200"/>
+      </w:pPr>
+      <w:r>
+        <w:rPr>
+          <w:color w:val="000000"/>
+          <w:sz w:val="20"/>
+          <w:szCs w:val="20"/>
+        </w:rPr>
+        <w:t xml:space="preserve">{{cb_mezczyzna}} Mężczyzna</w:t>
       </w:r>
     </w:p>
     <w:p>
@@ -1083,21 +1084,21 @@
           <w:sz w:val="20"/>
           <w:szCs w:val="20"/>
         </w:rPr>
-        <w:t>{{cb_miasto}}  Miasto (DEGURBA 1–2)</w:t>
-      </w:r>
-    </w:p>
-    <w:p>
-      <w:pPr>
-        <w:spacing w:before="20" w:after="20"/>
-        <w:ind w:left="200"/>
-      </w:pPr>
-      <w:r>
-        <w:rPr>
-          <w:color w:val="000000"/>
-          <w:sz w:val="20"/>
-          <w:szCs w:val="20"/>
-        </w:rPr>
-        <w:t>{{cb_wies}}  Obszar wiejski (DEGURBA 3)</w:t>
+        <w:t xml:space="preserve">{{cb_miasto}} Miasto (DEGURBA 1–2)</w:t>
+      </w:r>
+    </w:p>
+    <w:p>
+      <w:pPr>
+        <w:spacing w:before="20" w:after="20"/>
+        <w:ind w:left="200"/>
+      </w:pPr>
+      <w:r>
+        <w:rPr>
+          <w:color w:val="000000"/>
+          <w:sz w:val="20"/>
+          <w:szCs w:val="20"/>
+        </w:rPr>
+        <w:t xml:space="preserve">{{cb_wies}} Obszar wiejski (DEGURBA 3)</w:t>
       </w:r>
     </w:p>
     <w:p>
@@ -1168,7 +1169,7 @@
           <w:sz w:val="20"/>
           <w:szCs w:val="20"/>
         </w:rPr>
-        <w:t>☒  Osoba bezrobotna niezarejestrowana w PUP</w:t>
+        <w:t>☐  Osoba bezrobotna niezarejestrowana w PUP</w:t>
       </w:r>
     </w:p>
     <w:p>
@@ -1225,7 +1226,7 @@
           <w:sz w:val="20"/>
           <w:szCs w:val="20"/>
         </w:rPr>
-        <w:t>☒  Uczestnik CIS (skierowanie do CIS + Indywidualny Program Zatrudnienia Socjalnego, świadczenie integracyjne)</w:t>
+        <w:t>☐  Uczestnik CIS (skierowanie do CIS + Indywidualny Program Zatrudnienia Socjalnego, świadczenie integracyjne)</w:t>
       </w:r>
     </w:p>
     <w:p>
@@ -1283,35 +1284,35 @@
           <w:sz w:val="20"/>
           <w:szCs w:val="20"/>
         </w:rPr>
-        <w:t>{{cb_isced02}}  Średnie I stopnia lub niższe (ISCED 0-2)</w:t>
-      </w:r>
-    </w:p>
-    <w:p>
-      <w:pPr>
-        <w:spacing w:before="20" w:after="20"/>
-        <w:ind w:left="200"/>
-      </w:pPr>
-      <w:r>
-        <w:rPr>
-          <w:color w:val="000000"/>
-          <w:sz w:val="20"/>
-          <w:szCs w:val="20"/>
-        </w:rPr>
-        <w:t>{{cb_isced34}}  Ponadgimnazjalne (ISCED 3) lub policealne (ISCED 4)</w:t>
-      </w:r>
-    </w:p>
-    <w:p>
-      <w:pPr>
-        <w:spacing w:before="20" w:after="20"/>
-        <w:ind w:left="200"/>
-      </w:pPr>
-      <w:r>
-        <w:rPr>
-          <w:color w:val="000000"/>
-          <w:sz w:val="20"/>
-          <w:szCs w:val="20"/>
-        </w:rPr>
-        <w:t>{{cb_isced58}}  Wyższe (ISCED 5-8)</w:t>
+        <w:t xml:space="preserve">{{cb_isced02}} Średnie I stopnia lub niższe (ISCED 0-2)</w:t>
+      </w:r>
+    </w:p>
+    <w:p>
+      <w:pPr>
+        <w:spacing w:before="20" w:after="20"/>
+        <w:ind w:left="200"/>
+      </w:pPr>
+      <w:r>
+        <w:rPr>
+          <w:color w:val="000000"/>
+          <w:sz w:val="20"/>
+          <w:szCs w:val="20"/>
+        </w:rPr>
+        <w:t xml:space="preserve">{{cb_isced34}} Ponadgimnazjalne (ISCED 3) lub policealne (ISCED 4)</w:t>
+      </w:r>
+    </w:p>
+    <w:p>
+      <w:pPr>
+        <w:spacing w:before="20" w:after="20"/>
+        <w:ind w:left="200"/>
+      </w:pPr>
+      <w:r>
+        <w:rPr>
+          <w:color w:val="000000"/>
+          <w:sz w:val="20"/>
+          <w:szCs w:val="20"/>
+        </w:rPr>
+        <w:t xml:space="preserve">{{cb_isced58}} Wyższe (ISCED 5-8)</w:t>
       </w:r>
     </w:p>
     <w:p>
@@ -1478,7 +1479,7 @@
           <w:sz w:val="20"/>
           <w:szCs w:val="20"/>
         </w:rPr>
-        <w:t>☒  Osoba dotknięta ubóstwem</w:t>
+        <w:t>☐  Osoba dotknięta ubóstwem</w:t>
       </w:r>
     </w:p>
     <w:p>
@@ -1520,21 +1521,21 @@
           <w:sz w:val="20"/>
           <w:szCs w:val="20"/>
         </w:rPr>
-        <w:t>☒  Materiały w dużej czcionce</w:t>
-      </w:r>
-    </w:p>
-    <w:p>
-      <w:pPr>
-        <w:spacing w:before="20" w:after="20"/>
-        <w:ind w:left="200"/>
-      </w:pPr>
-      <w:r>
-        <w:rPr>
-          <w:color w:val="000000"/>
-          <w:sz w:val="20"/>
-          <w:szCs w:val="20"/>
-        </w:rPr>
-        <w:t>☒  Materiały w tekście łatwym do czytania (ETR)</w:t>
+        <w:t>☐  Materiały w dużej czcionce</w:t>
+      </w:r>
+    </w:p>
+    <w:p>
+      <w:pPr>
+        <w:spacing w:before="20" w:after="20"/>
+        <w:ind w:left="200"/>
+      </w:pPr>
+      <w:r>
+        <w:rPr>
+          <w:color w:val="000000"/>
+          <w:sz w:val="20"/>
+          <w:szCs w:val="20"/>
+        </w:rPr>
+        <w:t>☐  Materiały w tekście łatwym do czytania (ETR)</w:t>
       </w:r>
     </w:p>
     <w:p>
@@ -1730,21 +1731,21 @@
           <w:sz w:val="20"/>
           <w:szCs w:val="20"/>
         </w:rPr>
-        <w:t>{{cb_kobieta}}  Płeć żeńska (10 pkt)</w:t>
-      </w:r>
-    </w:p>
-    <w:p>
-      <w:pPr>
-        <w:spacing w:before="20" w:after="20"/>
-        <w:ind w:left="200"/>
-      </w:pPr>
-      <w:r>
-        <w:rPr>
-          <w:color w:val="000000"/>
-          <w:sz w:val="20"/>
-          <w:szCs w:val="20"/>
-        </w:rPr>
-        <w:t>☒  Wielokrotne wykluczenie: ☐ 2 formy (5 pkt) ☒ 3 i więcej form (10 pkt)</w:t>
+        <w:t xml:space="preserve">{{cb_kobieta}} Płeć żeńska (10 pkt)</w:t>
+      </w:r>
+    </w:p>
+    <w:p>
+      <w:pPr>
+        <w:spacing w:before="20" w:after="20"/>
+        <w:ind w:left="200"/>
+      </w:pPr>
+      <w:r>
+        <w:rPr>
+          <w:color w:val="000000"/>
+          <w:sz w:val="20"/>
+          <w:szCs w:val="20"/>
+        </w:rPr>
+        <w:t>☐  Wielokrotne wykluczenie: ☐ 2 formy (5 pkt) ☐ 3 i więcej form (10 pkt)</w:t>
       </w:r>
     </w:p>
     <w:p>
@@ -1970,21 +1971,21 @@
           <w:sz w:val="20"/>
           <w:szCs w:val="20"/>
         </w:rPr>
-        <w:t>☒  Potwierdzenie zamieszkania na terenie Gminy Świebodzin (kryterium terytorialne): oświadczenie/zaświadczenie o zamieszkaniu, wydruk z Profilu Zaufanego, zaświadczenie z ZUS z adresem zamieszkania.</w:t>
-      </w:r>
-    </w:p>
-    <w:p>
-      <w:pPr>
-        <w:spacing w:before="20" w:after="20"/>
-        <w:ind w:left="200"/>
-      </w:pPr>
-      <w:r>
-        <w:rPr>
-          <w:color w:val="000000"/>
-          <w:sz w:val="20"/>
-          <w:szCs w:val="20"/>
-        </w:rPr>
-        <w:t>☒  Zaświadczenie z PUP/ZUS o statusie osoby bezrobotnej / oświadczenie o bierności zawodowej.</w:t>
+        <w:t>☐  Potwierdzenie zamieszkania na terenie Gminy Świebodzin (kryterium terytorialne): oświadczenie/zaświadczenie o zamieszkaniu, wydruk z Profilu Zaufanego, zaświadczenie z ZUS z adresem zamieszkania.</w:t>
+      </w:r>
+    </w:p>
+    <w:p>
+      <w:pPr>
+        <w:spacing w:before="20" w:after="20"/>
+        <w:ind w:left="200"/>
+      </w:pPr>
+      <w:r>
+        <w:rPr>
+          <w:color w:val="000000"/>
+          <w:sz w:val="20"/>
+          <w:szCs w:val="20"/>
+        </w:rPr>
+        <w:t>☐  Zaświadczenie z PUP/ZUS o statusie osoby bezrobotnej / oświadczenie o bierności zawodowej.</w:t>
       </w:r>
     </w:p>
     <w:p>
@@ -2012,7 +2013,7 @@
           <w:sz w:val="20"/>
           <w:szCs w:val="20"/>
         </w:rPr>
-        <w:t>☒  Zaświadczenie z OPS / wywiad przy rekrutacji / dokumenty potwierdzające przesłanki wykluczenia.</w:t>
+        <w:t>☐  Zaświadczenie z OPS / wywiad przy rekrutacji / dokumenty potwierdzające przesłanki wykluczenia.</w:t>
       </w:r>
     </w:p>
     <w:p>
@@ -2220,7 +2221,6 @@
     </w:p>
     <w:p>
       <w:pPr>
-        <w:pageBreakBefore/>
         <w:spacing w:before="240"/>
       </w:pPr>
       <w:r>

</xml_diff>